<commit_message>
Incorporate adversarial review: downgrade Domain 6, reframe thesis
Major revisions based on formal independent adversarial review:
- Domain 6 (Capability Acceleration) downgraded from "MET" to "MIXED"
  after Kendall's tau analysis confirmed benchmark deceleration (p=0.006)
- Convergent conclusion reframed: 6/7 met, 1 mixed; thesis now explicitly
  weighted on transition speed rather than acceleration
- Counterargument #2 updated to concede the deceleration finding
- Added Independent_Adversarial_Review.md as formal published critique
- README updated with honest scorecard and adversarial review link
- Closing rewritten to acknowledge what the evidence does and does not support

Co-Authored-By: Claude Opus 4.6 <noreply@anthropic.com>
</commit_message>
<xml_diff>
--- a/docs/The_Singularity_Is_Here.docx
+++ b/docs/The_Singularity_Is_Here.docx
@@ -279,7 +279,7 @@
           <w:sz w:val="22"/>
           <w:szCs w:val="22"/>
         </w:rPr>
-        <w:t xml:space="preserve">Extraordinary claims require extraordinary evidence. This paper meets that standard by presenting convergent proof across seven independent domains. No single domain is sufficient. The argument is that all seven point in the same direction simultaneously — and that this convergence is itself the evidence.</w:t>
+        <w:t xml:space="preserve">Extraordinary claims require extraordinary evidence. This paper meets that standard by presenting convergent proof across seven independent domains. No single domain is sufficient. The argument is that the majority of these domains point in the same direction simultaneously — and that this convergence is itself the evidence.</w:t>
       </w:r>
     </w:p>
     <w:p>
@@ -302,7 +302,7 @@
           <w:sz w:val="22"/>
           <w:szCs w:val="22"/>
         </w:rPr>
-        <w:t xml:space="preserve">Each domain is evaluated against a specific threshold. If the threshold is met, the domain counts as evidence for singularity. We then assess how many of seven thresholds are met, address counterarguments explicitly, and present a synthesis.</w:t>
+        <w:t xml:space="preserve">Each domain is evaluated against a specific threshold. If the threshold is met, the domain counts as evidence for singularity. We then assess how many of seven thresholds are met, honestly acknowledge where the evidence is insufficient or mixed, address counterarguments explicitly, and present a synthesis.</w:t>
       </w:r>
     </w:p>
     <w:p>
@@ -341,7 +341,7 @@
           <w:sz w:val="22"/>
           <w:szCs w:val="22"/>
         </w:rPr>
-        <w:t xml:space="preserve">This is the first of three companion documents that together constitute a five-layer evidentiary package:</w:t>
+        <w:t xml:space="preserve">This is the first of several companion documents that together constitute a six-layer evidentiary package:</w:t>
       </w:r>
     </w:p>
     <w:p>
@@ -5120,7 +5120,7 @@
                 <w:sz w:val="22"/>
                 <w:szCs w:val="22"/>
               </w:rPr>
-              <w:t xml:space="preserve">The Acceleration Paradox</w:t>
+              <w:t xml:space="preserve">The Acceleration Paradox — and Its Limits</w:t>
             </w:r>
           </w:p>
           <w:p>
@@ -5134,7 +5134,7 @@
                 <w:sz w:val="22"/>
                 <w:szCs w:val="22"/>
               </w:rPr>
-              <w:t xml:space="preserve">If capabilities were plateauing, we would see lengthening intervals between benchmark records, stabilizing compute requirements, and increasing marginal cost per capability point. We observe the opposite on all three metrics. The system is not approaching an asymptote — it is still in the exponential phase.</w:t>
+              <w:t xml:space="preserve">Cost efficiency shows statistically significant acceleration (p = 0.008). But our own quantitative companion paper finds that 5 of 7 benchmark domains fit logistic S-curves, not exponentials, and Fisher's combined test yields p = 0.252 — failing to reject deceleration. An independent reanalysis using Kendall's tau on local improvement rates finds evidence of deceleration within GPQA (p = 0.015), SWE-bench (p = 0.035), and HumanEval (p = 0.035), with a combined p = 0.0057 favoring deceleration across capability benchmarks. This does not mean progress has stopped — it means the specific claim that capability improvement is itself accelerating is not supported on the benchmarks we chose. The strongest evidence here is speed and efficiency, not acceleration.</w:t>
             </w:r>
           </w:p>
         </w:tc>
@@ -5154,7 +5154,7 @@
           <w:rFonts w:ascii="Arial" w:cs="Arial" w:eastAsia="Arial" w:hAnsi="Arial"/>
           <w:b/>
           <w:bCs/>
-          <w:color w:val="27AE60"/>
+          <w:color w:val="C0392B"/>
           <w:sz w:val="22"/>
           <w:szCs w:val="22"/>
         </w:rPr>
@@ -5167,7 +5167,7 @@
           <w:sz w:val="22"/>
           <w:szCs w:val="22"/>
         </w:rPr>
-        <w:t xml:space="preserve">THRESHOLD MET (Confidence: HIGH). Cost down 280x, parameter efficiency up 142x, capability density doubling every 3.5 months, benchmarks saturating annually. The rate of improvement is accelerating on every measurable axis.</w:t>
+        <w:t xml:space="preserve">MIXED EVIDENCE. Cost efficiency shows strong, statistically significant acceleration (280x reduction, p = 0.008). Parameter efficiency gains are real (142x). But capability benchmarks show S-curve saturation, not acceleration — and independent statistical testing confirms deceleration within benchmarks. The speed of the transition is extraordinary; the claim that it is still accelerating is not supported by the data.</w:t>
       </w:r>
     </w:p>
     <w:p>
@@ -6622,7 +6622,7 @@
           <w:sz w:val="22"/>
           <w:szCs w:val="22"/>
         </w:rPr>
-        <w:t xml:space="preserve">The quantitative companion paper's own analysis shows 5 of 7 domains fit logistic S-curves, not exponentials. Fisher's combined test yields p = 0.252 — failing to reject deceleration. If acceleration supports the thesis and deceleration also supports the thesis, then nothing could refute it. That is rhetoric, not science.</w:t>
+        <w:t xml:space="preserve">The quantitative companion paper's own analysis shows 5 of 7 domains fit logistic S-curves, not exponentials. Fisher's combined test yields p = 0.252 — failing to reject deceleration. An independent reanalysis using Kendall's tau finds statistically significant deceleration within GPQA, SWE-bench, and HumanEval, with a combined p = 0.0057 favoring deceleration. If acceleration supports the thesis and deceleration also supports the thesis, then nothing could refute it. That is rhetoric, not science.</w:t>
       </w:r>
     </w:p>
     <w:p>
@@ -6647,7 +6647,7 @@
           <w:sz w:val="22"/>
           <w:szCs w:val="22"/>
         </w:rPr>
-        <w:t xml:space="preserve">This is a serious objection and we address it directly: we do not claim unbounded acceleration. We claim a phase transition has occurred. Logistic S-curves are the mathematical signature of phase transitions in every physical system — water boiling, magnetic phase transitions, population ecology. Rapid change through the transition, then stabilization in the new state. The falsification condition is specified: if benchmark capabilities regress, if cost efficiency flattens, if the economic integration reverses, the thesis fails. Those conditions have not been met.</w:t>
+        <w:t xml:space="preserve">This is a serious objection and we concede part of it. We have downgraded Domain 6 (Capability Acceleration) from "threshold met" to "mixed evidence" in recognition of this finding. We do not claim unbounded acceleration — and we no longer claim it is supported 7/7. What we do claim is that a phase transition has occurred. Logistic S-curves are the mathematical signature of phase transitions in every physical system — water boiling, magnetic phase transitions, population ecology. Rapid change through the transition, then stabilization in the new state. Deceleration at the tail end of an S-curve is expected behavior after a transition, not evidence against one. The falsification condition remains: if benchmark capabilities regress, if cost efficiency flattens, if the economic integration reverses, the thesis fails. Those conditions have not been met.</w:t>
       </w:r>
     </w:p>
     <w:p>
@@ -7352,7 +7352,7 @@
                 <w:sz w:val="20"/>
                 <w:szCs w:val="20"/>
               </w:rPr>
-              <w:t xml:space="preserve">7/7</w:t>
+              <w:t xml:space="preserve">✓</w:t>
             </w:r>
           </w:p>
         </w:tc>
@@ -7494,7 +7494,7 @@
                 <w:sz w:val="20"/>
                 <w:szCs w:val="20"/>
               </w:rPr>
-              <w:t xml:space="preserve">7/7</w:t>
+              <w:t xml:space="preserve">✓</w:t>
             </w:r>
           </w:p>
         </w:tc>
@@ -7640,7 +7640,7 @@
                 <w:sz w:val="20"/>
                 <w:szCs w:val="20"/>
               </w:rPr>
-              <w:t xml:space="preserve">7/7</w:t>
+              <w:t xml:space="preserve">✓</w:t>
             </w:r>
           </w:p>
         </w:tc>
@@ -7782,7 +7782,7 @@
                 <w:sz w:val="20"/>
                 <w:szCs w:val="20"/>
               </w:rPr>
-              <w:t xml:space="preserve">7/7</w:t>
+              <w:t xml:space="preserve">✓</w:t>
             </w:r>
           </w:p>
         </w:tc>
@@ -7928,7 +7928,7 @@
                 <w:sz w:val="20"/>
                 <w:szCs w:val="20"/>
               </w:rPr>
-              <w:t xml:space="preserve">7/7</w:t>
+              <w:t xml:space="preserve">✓</w:t>
             </w:r>
           </w:p>
         </w:tc>
@@ -7996,11 +7996,11 @@
                 <w:bCs/>
                 <w:i w:val="false"/>
                 <w:iCs w:val="false"/>
-                <w:color w:val="27AE60"/>
-                <w:sz w:val="20"/>
-                <w:szCs w:val="20"/>
-              </w:rPr>
-              <w:t xml:space="preserve">MET</w:t>
+                <w:color w:val="C0392B"/>
+                <w:sz w:val="20"/>
+                <w:szCs w:val="20"/>
+              </w:rPr>
+              <w:t xml:space="preserve">MIXED</w:t>
             </w:r>
           </w:p>
         </w:tc>
@@ -8035,7 +8035,7 @@
                 <w:sz w:val="20"/>
                 <w:szCs w:val="20"/>
               </w:rPr>
-              <w:t xml:space="preserve">280x cost reduction. 142x efficiency gain. 3.5-month density doubling.</w:t>
+              <w:t xml:space="preserve">280x cost reduction (p=0.008). 142x efficiency gain. But benchmark trajectories show S-curve saturation, not acceleration (combined deceleration p=0.006).</w:t>
             </w:r>
           </w:p>
         </w:tc>
@@ -8066,11 +8066,11 @@
                 <w:bCs/>
                 <w:i w:val="false"/>
                 <w:iCs w:val="false"/>
-                <w:color w:val="27AE60"/>
-                <w:sz w:val="20"/>
-                <w:szCs w:val="20"/>
-              </w:rPr>
-              <w:t xml:space="preserve">7/7</w:t>
+                <w:color w:val="C0392B"/>
+                <w:sz w:val="20"/>
+                <w:szCs w:val="20"/>
+              </w:rPr>
+              <w:t xml:space="preserve">—</w:t>
             </w:r>
           </w:p>
         </w:tc>
@@ -8216,7 +8216,7 @@
                 <w:sz w:val="20"/>
                 <w:szCs w:val="20"/>
               </w:rPr>
-              <w:t xml:space="preserve">7/7</w:t>
+              <w:t xml:space="preserve">✓</w:t>
             </w:r>
           </w:p>
         </w:tc>
@@ -8287,7 +8287,7 @@
                 <w:sz w:val="22"/>
                 <w:szCs w:val="22"/>
               </w:rPr>
-              <w:t xml:space="preserve">Seven independent domains of evidence. Seven thresholds met. No single domain is conclusive in isolation. But seven simultaneous signals from cognitive science, computer science, economics, scientific research, autonomous systems, capability metrics, and expert judgment — all pointing in the same direction, all within the same 24-month window — constitutes convergent evidence of a phase transition. The evidence presented here supports the conclusion that the singularity is not a prediction about 2045 or 2032 or 2028 — it is a description of the system we are living in right now. We are not approaching the singularity. We are in it.</w:t>
+              <w:t xml:space="preserve">Seven independent domains of evidence. Six thresholds met, one mixed. No single domain is conclusive in isolation. But six strong signals from cognitive science, computer science, economics, scientific research, autonomous systems, and expert judgment — plus extraordinary (if decelerating) capability gains — all within the same 24-month window, constitute convergent evidence of a phase transition. Capability acceleration (Domain 6) is the weakest link: cost efficiency accelerates, but benchmark improvement rates are slowing as S-curves saturate. This is consistent with a phase transition that has already occurred, not one that is still building. The evidence supports the conclusion that AI has entered a rapid, self-reinforcing phase transition that meets the majority of singularity criteria. Whether that constitutes “singularity” depends on whether you weight the speed of the transition or the acceleration of the transition. We weight speed — and by that measure, we are in it.</w:t>
             </w:r>
           </w:p>
         </w:tc>
@@ -8329,7 +8329,7 @@
           <w:sz w:val="22"/>
           <w:szCs w:val="22"/>
         </w:rPr>
-        <w:t xml:space="preserve">If this analysis is correct — and the convergent evidence strongly suggests it is — then every organization without an AI governance framework is operating in an ungoverned singularity. Every company that treats AI as a tool improvement project is bringing a strategy memo to a phase transition. And every leader who is waiting for the singularity to arrive is already late.</w:t>
+        <w:t xml:space="preserve">If this analysis is correct — and six of seven domains of evidence suggest it is — then every organization without an AI governance framework is operating in an ungoverned phase transition. Every company that treats AI as a tool improvement project is bringing a strategy memo to a structural shift. And every leader who is waiting for AI to mature is already late.</w:t>
       </w:r>
     </w:p>
     <w:p>
@@ -8352,7 +8352,7 @@
           <w:sz w:val="22"/>
           <w:szCs w:val="22"/>
         </w:rPr>
-        <w:t xml:space="preserve">But we do not ask you to take our word for it. We have published the strongest prosecution against this thesis and argued it with equal rigor (see "The Evidence Package," Part I). We have staked 20 falsifiable predictions on this claim, with pre-specified scoring criteria and verification dates (Part II). And we have shown that this transition is 13x faster than electrification, 6x faster than the internet, and 3x faster than smartphones — the fastest technology phase transition ever recorded (Part III).</w:t>
+        <w:t xml:space="preserve">We are transparent about what the evidence does not support. It does not support unbounded capability acceleration — our own statistical analysis and an independent adversarial reanalysis both confirm that benchmark improvement rates are decelerating as S-curves saturate. Domain 6 is scored as mixed, not met. But deceleration within a phase transition is not refutation of the transition. Water stops heating at 100°C — that does not mean it has not boiled.</w:t>
       </w:r>
     </w:p>
     <w:p>
@@ -8375,7 +8375,30 @@
           <w:sz w:val="22"/>
           <w:szCs w:val="22"/>
         </w:rPr>
-        <w:t xml:space="preserve">The question is no longer whether the singularity will happen. The evidence is open. The predictions are timestamped. The counterarguments are published. Evaluate it yourself.</w:t>
+        <w:t xml:space="preserve">We do not ask you to take our word for it. We have published the strongest prosecution against this thesis (see "The Evidence Package," Part I) and a formal independent adversarial review (see docs/Independent_Adversarial_Review.md). We have staked 20 falsifiable predictions on this claim (Part II). And we have shown that this transition is 13x faster than electrification, 6x faster than the internet, and 3x faster than smartphones — the fastest technology phase transition ever recorded (Part III).</w:t>
+      </w:r>
+    </w:p>
+    <w:p>
+      <w:pPr>
+        <w:spacing w:after="20"/>
+      </w:pPr>
+    </w:p>
+    <w:p>
+      <w:pPr>
+        <w:spacing w:after="120"/>
+      </w:pPr>
+      <w:r>
+        <w:rPr>
+          <w:rFonts w:ascii="Arial" w:cs="Arial" w:eastAsia="Arial" w:hAnsi="Arial"/>
+          <w:b w:val="false"/>
+          <w:bCs w:val="false"/>
+          <w:i w:val="false"/>
+          <w:iCs w:val="false"/>
+          <w:color w:val="333333"/>
+          <w:sz w:val="22"/>
+          <w:szCs w:val="22"/>
+        </w:rPr>
+        <w:t xml:space="preserve">The question is no longer whether AI will transform every domain of human activity. The evidence is open. The predictions are timestamped. The counterarguments — including the strongest ones — are published alongside the thesis. Evaluate it yourself.</w:t>
       </w:r>
     </w:p>
     <w:p>

</xml_diff>